<commit_message>
Revise LSEP essay: simpler English, why/what/how/how-long trade-off framework, employee impact focus
</commit_message>
<xml_diff>
--- a/deliverables/LSEP_Essay.docx
+++ b/deliverables/LSEP_Essay.docx
@@ -4,7 +4,7 @@
   <w:body>
     <w:p>
       <w:pPr>
-        <w:spacing w:before="0" w:after="80"/>
+        <w:spacing w:before="0" w:after="40"/>
         <w:jc w:val="center"/>
       </w:pPr>
       <w:r>
@@ -18,7 +18,7 @@
     </w:p>
     <w:p>
       <w:pPr>
-        <w:spacing w:after="40"/>
+        <w:spacing w:after="240"/>
         <w:jc w:val="center"/>
       </w:pPr>
       <w:r>
@@ -26,25 +26,14 @@
           <w:i/>
           <w:sz w:val="24"/>
         </w:rPr>
-        <w:t>Legal, Social, Ethical and Professional Implications of</w:t>
+        <w:t>CCTV-Based PPE Monitoring on the Factory Floor:</w:t>
+        <w:br/>
+        <w:t>Legal, Social, Ethical and Professional Considerations</w:t>
       </w:r>
     </w:p>
     <w:p>
       <w:pPr>
-        <w:spacing w:after="280"/>
-        <w:jc w:val="center"/>
-      </w:pPr>
-      <w:r>
-        <w:rPr>
-          <w:i/>
-          <w:sz w:val="24"/>
-        </w:rPr>
-        <w:t>CV-Based PPE Monitoring in a Factory Environment</w:t>
-      </w:r>
-    </w:p>
-    <w:p>
-      <w:pPr>
-        <w:spacing w:after="200"/>
+        <w:spacing w:after="120"/>
         <w:pBdr>
           <w:bottom w:val="single" w:sz="6" w:space="1" w:color="2E74B5"/>
         </w:pBdr>
@@ -52,362 +41,750 @@
     </w:p>
     <w:p>
       <w:pPr>
-        <w:spacing w:before="280" w:after="80"/>
+        <w:spacing w:before="240" w:after="80"/>
       </w:pPr>
       <w:r>
         <w:rPr>
           <w:b/>
           <w:color w:val="1F497D"/>
-          <w:sz w:val="28"/>
+          <w:sz w:val="26"/>
         </w:rPr>
         <w:t>1. Introduction</w:t>
       </w:r>
     </w:p>
     <w:p>
       <w:pPr>
-        <w:spacing w:after="120" w:before="0" w:line="260" w:lineRule="exact"/>
+        <w:spacing w:after="120" w:before="0" w:line="280" w:lineRule="exact"/>
       </w:pPr>
       <w:r>
-        <w:t>London Building Materials Manufacturing Ltd. is deploying a computer vision (CV) system to monitor whether factory workers are wearing the required personal protective equipment (PPE) — helmets, hi-vis vests, and goggles — using existing CCTV cameras. The system uses a deep learning model to analyse live footage and flag non-compliance automatically.</w:t>
+        <w:rPr>
+          <w:i w:val="0"/>
+          <w:sz w:val="22"/>
+        </w:rPr>
+        <w:t>London Building Materials Manufacturing Ltd. plans to use CCTV cameras and a computer vision (CV) system to check whether workers on the factory floor are wearing the correct PPE — helmets, hi-vis vests, and goggles. The cameras capture photos and video, and a deep learning model flags anyone not wearing the required equipment.</w:t>
       </w:r>
     </w:p>
     <w:p>
       <w:pPr>
-        <w:spacing w:after="120" w:before="0" w:line="260" w:lineRule="exact"/>
+        <w:spacing w:after="120" w:before="0" w:line="280" w:lineRule="exact"/>
       </w:pPr>
       <w:r>
-        <w:t>On the surface, this is a straightforward safety measure. In practice, it raises significant questions across legal, social, ethical, and professional dimensions. This essay analyses those implications and recommends a governance framework that allows the system to deliver safety benefits without causing harm.</w:t>
+        <w:rPr>
+          <w:i w:val="0"/>
+          <w:sz w:val="22"/>
+        </w:rPr>
+        <w:t>The safety goal is clear. But the moment a camera records a worker, four practical questions arise that determine whether the system is legal, fair, and responsible:</w:t>
       </w:r>
     </w:p>
     <w:p>
       <w:pPr>
-        <w:spacing w:before="280" w:after="80"/>
+        <w:pStyle w:val="ListBullet"/>
+        <w:spacing w:after="40"/>
+      </w:pPr>
+      <w:r>
+        <w:rPr>
+          <w:sz w:val="22"/>
+        </w:rPr>
+        <w:t>Why are we capturing this footage?</w:t>
+      </w:r>
+    </w:p>
+    <w:p>
+      <w:pPr>
+        <w:pStyle w:val="ListBullet"/>
+        <w:spacing w:after="40"/>
+      </w:pPr>
+      <w:r>
+        <w:rPr>
+          <w:sz w:val="22"/>
+        </w:rPr>
+        <w:t>What exactly should the camera record?</w:t>
+      </w:r>
+    </w:p>
+    <w:p>
+      <w:pPr>
+        <w:pStyle w:val="ListBullet"/>
+        <w:spacing w:after="40"/>
+      </w:pPr>
+      <w:r>
+        <w:rPr>
+          <w:sz w:val="22"/>
+        </w:rPr>
+        <w:t>How should the data be stored and used?</w:t>
+      </w:r>
+    </w:p>
+    <w:p>
+      <w:pPr>
+        <w:pStyle w:val="ListBullet"/>
+        <w:spacing w:after="40"/>
+      </w:pPr>
+      <w:r>
+        <w:rPr>
+          <w:sz w:val="22"/>
+        </w:rPr>
+        <w:t>How long should we keep it?</w:t>
+      </w:r>
+    </w:p>
+    <w:p>
+      <w:pPr>
+        <w:spacing w:after="80" w:before="0" w:line="280" w:lineRule="exact"/>
+      </w:pPr>
+      <w:r>
+        <w:rPr>
+          <w:i w:val="0"/>
+          <w:sz w:val="22"/>
+        </w:rPr>
+        <w:t>This essay works through these questions across the legal, social, ethical, and professional dimensions — and proposes a practical balance that protects workers while meeting the company's safety obligations.</w:t>
+      </w:r>
+    </w:p>
+    <w:p>
+      <w:pPr>
+        <w:spacing w:before="240" w:after="80"/>
       </w:pPr>
       <w:r>
         <w:rPr>
           <w:b/>
           <w:color w:val="1F497D"/>
-          <w:sz w:val="28"/>
+          <w:sz w:val="26"/>
         </w:rPr>
         <w:t>2. Legal Implications</w:t>
       </w:r>
     </w:p>
     <w:p>
       <w:pPr>
-        <w:spacing w:before="200" w:after="80"/>
+        <w:spacing w:after="120" w:before="0" w:line="280" w:lineRule="exact"/>
+      </w:pPr>
+      <w:r>
+        <w:rPr>
+          <w:i w:val="0"/>
+          <w:sz w:val="22"/>
+        </w:rPr>
+        <w:t>The moment a camera records a worker's face, it captures personal data under the General Data Protection Regulation (GDPR). Facial images are biometric data — the most sensitive category under the law. The UAE Personal Data Protection Law (PDPL, Federal Decree-Law No. 45 of 2021) applies the same principle: recording workers requires a documented lawful basis. For PPE safety, that basis exists — but the law does not stop there.</w:t>
+      </w:r>
+    </w:p>
+    <w:p>
+      <w:pPr>
+        <w:spacing w:after="100" w:before="0" w:line="280" w:lineRule="exact"/>
       </w:pPr>
       <w:r>
         <w:rPr>
           <w:b/>
-          <w:color w:val="2E74B5"/>
-          <w:sz w:val="24"/>
+          <w:sz w:val="22"/>
         </w:rPr>
-        <w:t>Data Protection Law</w:t>
+        <w:t xml:space="preserve">Why capture? </w:t>
+      </w:r>
+      <w:r>
+        <w:rPr>
+          <w:sz w:val="22"/>
+        </w:rPr>
+        <w:t>The company must record the specific legal purpose: PPE compliance on active work zones. Using the same footage to track movement, measure productivity, or monitor timekeeping is a legal violation without separate consent.</w:t>
       </w:r>
     </w:p>
     <w:p>
       <w:pPr>
-        <w:spacing w:after="120" w:before="0" w:line="260" w:lineRule="exact"/>
+        <w:spacing w:after="100" w:before="0" w:line="280" w:lineRule="exact"/>
       </w:pPr>
       <w:r>
-        <w:t>Factory CCTV footage captures workers’ faces, which qualifies as biometric personal data under the General Data Protection Regulation (GDPR). This triggers several obligations: the company must establish a lawful basis for processing (most likely legitimate interest in workplace safety), ensure data is used only for that stated purpose (purpose limitation), collect only what is needed (data minimisation), and provide workers with the right to access or delete their data.</w:t>
+        <w:rPr>
+          <w:b/>
+          <w:sz w:val="22"/>
+        </w:rPr>
+        <w:t xml:space="preserve">What to capture? </w:t>
+      </w:r>
+      <w:r>
+        <w:rPr>
+          <w:sz w:val="22"/>
+        </w:rPr>
+        <w:t>Data minimisation requires that cameras cover only areas where PPE is mandatory — production floor, loading bays. Break rooms, canteens, and toilets must be excluded. Where technically feasible, the system should detect PPE items only, without storing identifiable facial images.</w:t>
       </w:r>
     </w:p>
     <w:p>
       <w:pPr>
-        <w:spacing w:after="120" w:before="0" w:line="260" w:lineRule="exact"/>
+        <w:spacing w:after="100" w:before="0" w:line="280" w:lineRule="exact"/>
       </w:pPr>
       <w:r>
-        <w:t>As a UAE-based programme, the Personal Data Protection Law (PDPL) — Federal Decree-Law No. 45 of 2021 — applies directly. It requires a legitimate legal basis before processing personal data and grants individuals rights of access and correction. Any deployment must demonstrate compliance with both frameworks.</w:t>
+        <w:rPr>
+          <w:b/>
+          <w:sz w:val="22"/>
+        </w:rPr>
+        <w:t xml:space="preserve">How to capture? </w:t>
+      </w:r>
+      <w:r>
+        <w:rPr>
+          <w:sz w:val="22"/>
+        </w:rPr>
+        <w:t>Workers must be informed in writing before the system goes live: what the camera detects, who sees the alerts, and how errors are handled. A Data Protection Impact Assessment (DPIA) is required before rollout. If the system triggers disciplinary action, workers have the legal right to human review — a fully automated disciplinary pipeline is not lawful.</w:t>
       </w:r>
     </w:p>
     <w:p>
       <w:pPr>
-        <w:spacing w:before="200" w:after="80"/>
+        <w:spacing w:after="100" w:before="0" w:line="280" w:lineRule="exact"/>
       </w:pPr>
       <w:r>
         <w:rPr>
           <w:b/>
-          <w:color w:val="2E74B5"/>
-          <w:sz w:val="24"/>
+          <w:sz w:val="22"/>
         </w:rPr>
-        <w:t>Workplace Safety Law</w:t>
+        <w:t xml:space="preserve">How long to keep it? </w:t>
+      </w:r>
+      <w:r>
+        <w:rPr>
+          <w:sz w:val="22"/>
+        </w:rPr>
+        <w:t>This is where most organisations fail. GDPR requires footage to be kept only as long as necessary. For routine compliance checks, 30 days is a widely accepted standard. Footage linked to a safety incident may be retained for 90–180 days — but this must be documented and automatically enforced, not left to accumulate indefinitely.</w:t>
       </w:r>
     </w:p>
     <w:p>
       <w:pPr>
-        <w:spacing w:after="120" w:before="0" w:line="260" w:lineRule="exact"/>
+        <w:spacing w:after="120" w:before="0" w:line="280" w:lineRule="exact"/>
       </w:pPr>
       <w:r>
-        <w:t>Regulations from HSE (UK) and OSHA (US) place a legal duty of care on employers to enforce PPE compliance. An automated monitoring system directly supports that duty. However, a critical risk arises from false negatives — instances where the model fails to detect a missing helmet. If a worker is injured following an undetected violation, and the company relied solely on an imperfect AI system without human checks, this could expose the organisation to significant legal liability.</w:t>
+        <w:rPr>
+          <w:i w:val="0"/>
+          <w:sz w:val="22"/>
+        </w:rPr>
+        <w:t>HSE (UK) and OSHA (US) place a legal duty of care on employers to enforce PPE compliance. The CV system supports this duty. However, false negatives — cases where the model misses a worker without a helmet — are a legal liability. If a worker is injured after an undetected violation, relying solely on an imperfect AI system without human checks exposes the company to significant legal risk.</w:t>
       </w:r>
     </w:p>
     <w:p>
       <w:pPr>
-        <w:spacing w:before="200" w:after="80"/>
-      </w:pPr>
-      <w:r>
-        <w:rPr>
-          <w:b/>
-          <w:color w:val="2E74B5"/>
-          <w:sz w:val="24"/>
-        </w:rPr>
-        <w:t>CCTV and Automated Decisions</w:t>
-      </w:r>
-    </w:p>
-    <w:p>
-      <w:pPr>
-        <w:spacing w:after="120" w:before="0" w:line="260" w:lineRule="exact"/>
-      </w:pPr>
-      <w:r>
-        <w:t>Deploying camera-based monitoring typically requires a Data Protection Impact Assessment (DPIA) before rollout, visible notices informing workers that recording is in place, and a documented footage retention policy. If the system issues alerts that directly trigger disciplinary action, employees have the right to understand how that decision was made — placing additional obligations on the company to ensure explainability and human review.</w:t>
-      </w:r>
-    </w:p>
-    <w:p>
-      <w:pPr>
-        <w:spacing w:before="280" w:after="80"/>
+        <w:spacing w:before="240" w:after="80"/>
       </w:pPr>
       <w:r>
         <w:rPr>
           <w:b/>
           <w:color w:val="1F497D"/>
-          <w:sz w:val="28"/>
+          <w:sz w:val="26"/>
         </w:rPr>
-        <w:t>3. Social Implications</w:t>
+        <w:t>3. Social Implications: How Monitoring Affects Employees</w:t>
       </w:r>
     </w:p>
     <w:p>
       <w:pPr>
-        <w:spacing w:after="120" w:before="0" w:line="260" w:lineRule="exact"/>
+        <w:spacing w:after="100" w:before="0" w:line="280" w:lineRule="exact"/>
       </w:pPr>
       <w:r>
         <w:rPr>
           <w:b/>
+          <w:sz w:val="22"/>
         </w:rPr>
-        <w:t xml:space="preserve">Surveillance and trust.  </w:t>
+        <w:t xml:space="preserve">Performance. </w:t>
       </w:r>
       <w:r>
-        <w:t>Continuous automated monitoring can fundamentally change the relationship between workers and management. When employees know they are watched at all times — even if only for safety — it can reduce morale and create a culture of distrust.</w:t>
+        <w:rPr>
+          <w:sz w:val="22"/>
+        </w:rPr>
+        <w:t>Workers who feel constantly watched often become anxious and slow down — not because they are doing anything wrong, but because they are aware of being observed at all times. This is called the chilling effect. The system is meant to improve safety; if it raises stress and reduces performance, it has created new risks instead of reducing them.</w:t>
       </w:r>
     </w:p>
     <w:p>
       <w:pPr>
-        <w:spacing w:after="120" w:before="0" w:line="260" w:lineRule="exact"/>
+        <w:spacing w:after="100" w:before="0" w:line="280" w:lineRule="exact"/>
       </w:pPr>
       <w:r>
         <w:rPr>
           <w:b/>
+          <w:sz w:val="22"/>
         </w:rPr>
-        <w:t xml:space="preserve">Chilling effect.  </w:t>
+        <w:t xml:space="preserve">Safety culture. </w:t>
       </w:r>
       <w:r>
-        <w:t>Even fully compliant workers may experience psychological stress from the constant awareness of being observed. This can reduce concentration and wellbeing, directly undermining the safe working environment the system is intended to support.</w:t>
+        <w:rPr>
+          <w:sz w:val="22"/>
+        </w:rPr>
+        <w:t>There is a meaningful difference between workers who wear PPE because they understand why it matters, and workers who wear it because a camera is watching. The second group will stop complying the moment surveillance lapses. A camera system that replaces safety culture rather than reinforcing it is fragile. Workers should be involved in shaping how the system works — they often know the real compliance problems better than management does.</w:t>
       </w:r>
     </w:p>
     <w:p>
       <w:pPr>
-        <w:spacing w:after="120" w:before="0" w:line="260" w:lineRule="exact"/>
+        <w:spacing w:after="100" w:before="0" w:line="280" w:lineRule="exact"/>
       </w:pPr>
       <w:r>
         <w:rPr>
           <w:b/>
+          <w:sz w:val="22"/>
         </w:rPr>
-        <w:t xml:space="preserve">Surveillance creep.  </w:t>
+        <w:t xml:space="preserve">Trust and morale. </w:t>
       </w:r>
       <w:r>
-        <w:t>A system deployed for PPE safety can gradually be repurposed for productivity tracking or disciplinary action without workers’ consent. This is a documented pattern in workplace technology. Explicit policy constraints, reviewed by HR and worker representatives, are essential to prevent scope expansion.</w:t>
+        <w:rPr>
+          <w:sz w:val="22"/>
+        </w:rPr>
+        <w:t>Deploying any monitoring system without prior consultation damages trust. Workers who feel watched but not heard will view the system as punitive, not protective. Involving worker representatives, safety committees, and unions in the design process produces better outcomes and reduces resistance.</w:t>
       </w:r>
     </w:p>
     <w:p>
       <w:pPr>
-        <w:spacing w:after="120" w:before="0" w:line="260" w:lineRule="exact"/>
+        <w:spacing w:after="100" w:before="0" w:line="280" w:lineRule="exact"/>
       </w:pPr>
       <w:r>
         <w:rPr>
           <w:b/>
+          <w:sz w:val="22"/>
         </w:rPr>
-        <w:t xml:space="preserve">Equity concerns.  </w:t>
+        <w:t xml:space="preserve">Surveillance creep. </w:t>
       </w:r>
       <w:r>
-        <w:t>The system may perform differently across workers with different skin tones, body sizes, or who wear culturally different forms of protective gear. If certain groups are flagged more frequently due to model error, the result is unequal and potentially discriminatory enforcement.</w:t>
+        <w:rPr>
+          <w:sz w:val="22"/>
+        </w:rPr>
+        <w:t>A camera installed for PPE safety can quietly expand into productivity tracking, break-time monitoring, or behavioural analysis — without workers consenting to this broader use. The company must publish a binding policy that limits use to safety compliance only, reviewed annually with worker input.</w:t>
       </w:r>
     </w:p>
     <w:p>
       <w:pPr>
-        <w:spacing w:before="280" w:after="80"/>
+        <w:spacing w:before="240" w:after="80"/>
       </w:pPr>
       <w:r>
         <w:rPr>
           <w:b/>
           <w:color w:val="1F497D"/>
-          <w:sz w:val="28"/>
+          <w:sz w:val="26"/>
         </w:rPr>
         <w:t>4. Ethical Implications</w:t>
       </w:r>
     </w:p>
     <w:p>
       <w:pPr>
-        <w:spacing w:after="120" w:before="0" w:line="260" w:lineRule="exact"/>
+        <w:spacing w:after="100" w:before="0" w:line="280" w:lineRule="exact"/>
       </w:pPr>
       <w:r>
         <w:rPr>
           <w:b/>
+          <w:sz w:val="22"/>
         </w:rPr>
-        <w:t xml:space="preserve">Algorithmic bias.  </w:t>
+        <w:t xml:space="preserve">Algorithmic bias. </w:t>
       </w:r>
       <w:r>
-        <w:t>The model’s fairness depends entirely on the diversity of its training data. The landmark Buolamwini and Gebru (2018) “Gender Shades” study demonstrated this clearly: commercial facial recognition systems had error rates up to 34% higher on dark-skinned women compared to light-skinned men. A PPE detection system trained without demographic diversity could reproduce exactly this pattern.</w:t>
+        <w:rPr>
+          <w:sz w:val="22"/>
+        </w:rPr>
+        <w:t>The CV model learns from its training data. If that data does not represent the full diversity of the workforce — different skin tones, body sizes, protective gear styles — the model will be less accurate for underrepresented groups. Buolamwini and Gebru's 2018 Gender Shades study found that commercial CV systems had error rates up to 34% higher for dark-skinned women. A PPE system with similar bias will flag certain workers disproportionately — creating discriminatory enforcement driven by model error, not actual non-compliance.</w:t>
       </w:r>
     </w:p>
     <w:p>
       <w:pPr>
-        <w:spacing w:after="120" w:before="0" w:line="260" w:lineRule="exact"/>
+        <w:spacing w:after="100" w:before="0" w:line="280" w:lineRule="exact"/>
       </w:pPr>
       <w:r>
         <w:rPr>
           <w:b/>
+          <w:sz w:val="22"/>
         </w:rPr>
-        <w:t xml:space="preserve">Consent and transparency.  </w:t>
+        <w:t xml:space="preserve">Informed consent. </w:t>
       </w:r>
       <w:r>
-        <w:t>Were workers consulted before the system was deployed? Do they understand what it flags and how errors are handled? Informed consent is not just a legal requirement — it is an ethical baseline. Deploying surveillance technology without meaningful transparency undermines worker dignity, even when the intent is protective.</w:t>
+        <w:rPr>
+          <w:sz w:val="22"/>
+        </w:rPr>
+        <w:t>Workers should not learn about the system from a notice on the wall after it is already running. They should be told before deployment: what the camera captures, how accurate the model is, what happens when it raises an alert, and how to challenge a decision they believe is wrong.</w:t>
       </w:r>
     </w:p>
     <w:p>
       <w:pPr>
-        <w:spacing w:after="120" w:before="0" w:line="260" w:lineRule="exact"/>
+        <w:spacing w:after="100" w:before="0" w:line="280" w:lineRule="exact"/>
       </w:pPr>
       <w:r>
         <w:rPr>
           <w:b/>
+          <w:sz w:val="22"/>
         </w:rPr>
-        <w:t xml:space="preserve">Proportionality.  </w:t>
+        <w:t xml:space="preserve">Proportionality. </w:t>
       </w:r>
       <w:r>
-        <w:t>Is continuous AI monitoring proportionate to the safety risk? Could regular supervisor checks, physical audits, or improved PPE availability achieve equivalent safety outcomes with less invasiveness? These alternatives should be evaluated and documented before committing to automated surveillance.</w:t>
+        <w:rPr>
+          <w:sz w:val="22"/>
+        </w:rPr>
+        <w:t>The system should do only what is needed for safety. It should not log which zone a worker stands in, how often they move, or how long they take on a task. If regular supervisor checks or improved PPE availability could achieve comparable safety outcomes with less invasiveness, those options should be documented and considered alongside the camera system.</w:t>
       </w:r>
     </w:p>
     <w:p>
       <w:pPr>
-        <w:spacing w:after="120" w:before="0" w:line="260" w:lineRule="exact"/>
+        <w:spacing w:after="100" w:before="0" w:line="280" w:lineRule="exact"/>
       </w:pPr>
       <w:r>
         <w:rPr>
           <w:b/>
+          <w:sz w:val="22"/>
         </w:rPr>
-        <w:t xml:space="preserve">Power asymmetry.  </w:t>
+        <w:t xml:space="preserve">Power asymmetry. </w:t>
       </w:r>
       <w:r>
-        <w:t>Workers in non-unionised or temporary roles have limited ability to contest automated decisions. This imbalance places a heightened ethical duty on the organisation not to use the system in ways that harm workers who lack the means to defend themselves.</w:t>
+        <w:rPr>
+          <w:sz w:val="22"/>
+        </w:rPr>
+        <w:t>Workers — particularly those in temporary or non-unionised roles — have limited ability to contest automated decisions. This imbalance places a heightened duty on the organisation: the system must never be used in a way that harms workers who cannot easily defend themselves.</w:t>
       </w:r>
     </w:p>
     <w:p>
       <w:pPr>
-        <w:spacing w:before="280" w:after="80"/>
+        <w:spacing w:before="240" w:after="80"/>
       </w:pPr>
       <w:r>
         <w:rPr>
           <w:b/>
           <w:color w:val="1F497D"/>
-          <w:sz w:val="28"/>
+          <w:sz w:val="26"/>
         </w:rPr>
         <w:t>5. Professional Implications</w:t>
       </w:r>
     </w:p>
     <w:p>
       <w:pPr>
-        <w:spacing w:after="120" w:before="0" w:line="260" w:lineRule="exact"/>
+        <w:spacing w:after="100" w:before="0" w:line="280" w:lineRule="exact"/>
       </w:pPr>
       <w:r>
         <w:rPr>
           <w:b/>
+          <w:sz w:val="22"/>
         </w:rPr>
-        <w:t xml:space="preserve">Codes of ethics.  </w:t>
+        <w:t xml:space="preserve">Codes of ethics. </w:t>
       </w:r>
       <w:r>
-        <w:t>The BCS, IEEE, and ACM all require computing professionals to place public welfare above organisational interests, disclose system limitations honestly, and avoid harm. Engineers building this system have a professional obligation to refuse deployment where safety cannot be adequately assured.</w:t>
+        <w:rPr>
+          <w:sz w:val="22"/>
+        </w:rPr>
+        <w:t>The BCS, IEEE, and ACM all require computing professionals to place public welfare above commercial interest. The engineers building this system have a professional obligation to test accuracy across all worker demographics, document known failure modes honestly, and refuse deployment if they believe the system will cause harm.</w:t>
       </w:r>
     </w:p>
     <w:p>
       <w:pPr>
-        <w:spacing w:after="120" w:before="0" w:line="260" w:lineRule="exact"/>
+        <w:spacing w:after="100" w:before="0" w:line="280" w:lineRule="exact"/>
       </w:pPr>
       <w:r>
         <w:rPr>
           <w:b/>
+          <w:sz w:val="22"/>
         </w:rPr>
-        <w:t xml:space="preserve">Model documentation.  </w:t>
+        <w:t xml:space="preserve">Model documentation. </w:t>
       </w:r>
       <w:r>
-        <w:t>Responsible deployment requires a model card: a document describing what the model does, its known failure modes, the populations it was tested on, its accuracy across demographic groups, and what post-deployment monitoring is in place. Without this, the organisation cannot make informed decisions about when to trust or override the system.</w:t>
+        <w:rPr>
+          <w:sz w:val="22"/>
+        </w:rPr>
+        <w:t>Responsible deployment requires a model card: a plain-language document stating what the model detects, how accurate it is, which groups it was tested on, and what its known weaknesses are. Without this, the organisation cannot make informed decisions about when to trust or override the system.</w:t>
       </w:r>
     </w:p>
     <w:p>
       <w:pPr>
-        <w:spacing w:after="120" w:before="0" w:line="260" w:lineRule="exact"/>
+        <w:spacing w:after="100" w:before="0" w:line="280" w:lineRule="exact"/>
       </w:pPr>
       <w:r>
         <w:rPr>
           <w:b/>
+          <w:sz w:val="22"/>
         </w:rPr>
-        <w:t xml:space="preserve">Human-in-the-loop.  </w:t>
+        <w:t xml:space="preserve">Human-in-the-loop. </w:t>
       </w:r>
       <w:r>
-        <w:t>For high-stakes outcomes — issuing safety warnings, initiating disciplinary processes, or determining PPE compliance during incident investigations — a human must review the model’s output before action is taken. Fully automated disciplinary pipelines are both ethically indefensible and legally risky. The Clearview AI case (GDPR violations from mass image scraping without consent) and the Amazon Rekognition controversy (significant demographic bias in a widely-deployed CV system) illustrate what happens when AI systems are rushed to deployment without adequate oversight.</w:t>
+        <w:rPr>
+          <w:sz w:val="22"/>
+        </w:rPr>
+        <w:t>No automated alert should directly trigger a disciplinary action. A safety officer or line manager must review each flag, consider the context, and decide whether to act. The Clearview AI case — where billions of faces were scraped and processed without consent, resulting in multiple GDPR enforcement actions — and the Amazon Rekognition controversy — where demographic bias was demonstrated at scale in a widely-deployed CV system — both show what happens when AI is deployed without adequate human oversight.</w:t>
       </w:r>
     </w:p>
     <w:p>
       <w:pPr>
-        <w:spacing w:after="120" w:before="0" w:line="260" w:lineRule="exact"/>
+        <w:spacing w:after="100" w:before="0" w:line="280" w:lineRule="exact"/>
       </w:pPr>
       <w:r>
         <w:rPr>
           <w:b/>
+          <w:sz w:val="22"/>
         </w:rPr>
-        <w:t xml:space="preserve">Continuous auditing.  </w:t>
+        <w:t xml:space="preserve">Continuous auditing. </w:t>
       </w:r>
       <w:r>
-        <w:t>Model performance drifts as factory conditions change. The organisation should commit to regular audits measuring accuracy and fairness across demographic subgroups, triggering retraining when thresholds are breached. This aligns with the UAE AI Strategy, which explicitly mandates fairness, transparency, and accountability in AI workplace applications.</w:t>
+        <w:rPr>
+          <w:sz w:val="22"/>
+        </w:rPr>
+        <w:t>Accuracy drifts as factory conditions change: new lighting, seasonal PPE variations, workforce changes. The system should be audited quarterly. If error rates rise for any group of workers, the model must be retrained before enforcement continues. Audit results should be shared with worker representatives. This is consistent with the UAE AI Strategy, which mandates fairness, transparency, and accountability in AI applications within the workplace.</w:t>
       </w:r>
     </w:p>
     <w:p>
       <w:pPr>
-        <w:spacing w:before="280" w:after="80"/>
+        <w:spacing w:before="240" w:after="80"/>
       </w:pPr>
       <w:r>
         <w:rPr>
           <w:b/>
           <w:color w:val="1F497D"/>
-          <w:sz w:val="28"/>
+          <w:sz w:val="26"/>
         </w:rPr>
-        <w:t>6. Conclusion</w:t>
+        <w:t>6. Finding the Right Balance</w:t>
       </w:r>
     </w:p>
     <w:p>
       <w:pPr>
-        <w:spacing w:after="120" w:before="0" w:line="260" w:lineRule="exact"/>
+        <w:spacing w:after="120" w:before="0" w:line="280" w:lineRule="exact"/>
       </w:pPr>
       <w:r>
-        <w:t>A CV-based PPE monitoring system can meaningfully improve worker safety at London Building Materials Manufacturing Ltd. — but only if built and governed responsibly. The analysis across all four LSEP dimensions points to the same requirements: legal compliance under GDPR and UAE PDPL, informed worker consent, demographically diverse training data, mandatory human review before any disciplinary action, and ongoing fairness auditing.</w:t>
+        <w:rPr>
+          <w:i w:val="0"/>
+          <w:sz w:val="22"/>
+        </w:rPr>
+        <w:t>The four questions — why, what, how, and how long — translate directly into a practical governance framework. Getting these right protects the company legally and produces a system that workers can trust:</w:t>
+      </w:r>
+    </w:p>
+    <w:tbl>
+      <w:tblPr>
+        <w:tblStyle w:val="TableGrid"/>
+        <w:tblW w:type="auto" w:w="0"/>
+        <w:tblLook w:firstColumn="1" w:firstRow="1" w:lastColumn="0" w:lastRow="0" w:noHBand="0" w:noVBand="1" w:val="04A0"/>
+      </w:tblPr>
+      <w:tblGrid>
+        <w:gridCol w:w="4703"/>
+        <w:gridCol w:w="4703"/>
+      </w:tblGrid>
+      <w:tr>
+        <w:tc>
+          <w:tcPr>
+            <w:tcW w:type="dxa" w:w="4703"/>
+            <w:shd w:val="clear" w:color="auto" w:fill="BDD7EE"/>
+          </w:tcPr>
+          <w:p>
+            <w:pPr>
+              <w:spacing w:after="40"/>
+            </w:pPr>
+            <w:r>
+              <w:rPr>
+                <w:b/>
+                <w:sz w:val="20"/>
+              </w:rPr>
+              <w:t>Question</w:t>
+            </w:r>
+          </w:p>
+        </w:tc>
+        <w:tc>
+          <w:tcPr>
+            <w:tcW w:type="dxa" w:w="4703"/>
+            <w:shd w:val="clear" w:color="auto" w:fill="BDD7EE"/>
+          </w:tcPr>
+          <w:p>
+            <w:pPr>
+              <w:spacing w:after="40"/>
+            </w:pPr>
+            <w:r>
+              <w:rPr>
+                <w:b/>
+                <w:sz w:val="20"/>
+              </w:rPr>
+              <w:t>Practical Guideline</w:t>
+            </w:r>
+          </w:p>
+        </w:tc>
+      </w:tr>
+      <w:tr>
+        <w:tc>
+          <w:tcPr>
+            <w:tcW w:type="dxa" w:w="4703"/>
+          </w:tcPr>
+          <w:p>
+            <w:pPr>
+              <w:spacing w:after="40"/>
+            </w:pPr>
+            <w:r>
+              <w:rPr>
+                <w:sz w:val="20"/>
+              </w:rPr>
+              <w:t>Why capture?</w:t>
+            </w:r>
+          </w:p>
+        </w:tc>
+        <w:tc>
+          <w:tcPr>
+            <w:tcW w:type="dxa" w:w="4703"/>
+          </w:tcPr>
+          <w:p>
+            <w:pPr>
+              <w:spacing w:after="40"/>
+            </w:pPr>
+            <w:r>
+              <w:rPr>
+                <w:sz w:val="20"/>
+              </w:rPr>
+              <w:t>PPE compliance only. Purpose documented in writing. No secondary use without re-consent.</w:t>
+            </w:r>
+          </w:p>
+        </w:tc>
+      </w:tr>
+      <w:tr>
+        <w:tc>
+          <w:tcPr>
+            <w:tcW w:type="dxa" w:w="4703"/>
+          </w:tcPr>
+          <w:p>
+            <w:pPr>
+              <w:spacing w:after="40"/>
+            </w:pPr>
+            <w:r>
+              <w:rPr>
+                <w:sz w:val="20"/>
+              </w:rPr>
+              <w:t>What to capture?</w:t>
+            </w:r>
+          </w:p>
+        </w:tc>
+        <w:tc>
+          <w:tcPr>
+            <w:tcW w:type="dxa" w:w="4703"/>
+          </w:tcPr>
+          <w:p>
+            <w:pPr>
+              <w:spacing w:after="40"/>
+            </w:pPr>
+            <w:r>
+              <w:rPr>
+                <w:sz w:val="20"/>
+              </w:rPr>
+              <w:t>Active work zones only. No break rooms or canteens. No identifiable face storage where avoidable. No behavioural tracking.</w:t>
+            </w:r>
+          </w:p>
+        </w:tc>
+      </w:tr>
+      <w:tr>
+        <w:tc>
+          <w:tcPr>
+            <w:tcW w:type="dxa" w:w="4703"/>
+          </w:tcPr>
+          <w:p>
+            <w:pPr>
+              <w:spacing w:after="40"/>
+            </w:pPr>
+            <w:r>
+              <w:rPr>
+                <w:sz w:val="20"/>
+              </w:rPr>
+              <w:t>How to capture?</w:t>
+            </w:r>
+          </w:p>
+        </w:tc>
+        <w:tc>
+          <w:tcPr>
+            <w:tcW w:type="dxa" w:w="4703"/>
+          </w:tcPr>
+          <w:p>
+            <w:pPr>
+              <w:spacing w:after="40"/>
+            </w:pPr>
+            <w:r>
+              <w:rPr>
+                <w:sz w:val="20"/>
+              </w:rPr>
+              <w:t>Workers informed and consulted before go-live. DPIA completed. Human review before any disciplinary action. Alerts, not automatic penalties.</w:t>
+            </w:r>
+          </w:p>
+        </w:tc>
+      </w:tr>
+      <w:tr>
+        <w:tc>
+          <w:tcPr>
+            <w:tcW w:type="dxa" w:w="4703"/>
+          </w:tcPr>
+          <w:p>
+            <w:pPr>
+              <w:spacing w:after="40"/>
+            </w:pPr>
+            <w:r>
+              <w:rPr>
+                <w:sz w:val="20"/>
+              </w:rPr>
+              <w:t>How long to keep?</w:t>
+            </w:r>
+          </w:p>
+        </w:tc>
+        <w:tc>
+          <w:tcPr>
+            <w:tcW w:type="dxa" w:w="4703"/>
+          </w:tcPr>
+          <w:p>
+            <w:pPr>
+              <w:spacing w:after="40"/>
+            </w:pPr>
+            <w:r>
+              <w:rPr>
+                <w:sz w:val="20"/>
+              </w:rPr>
+              <w:t>30 days for routine checks. 90–180 days for incident footage. Automatic deletion enforced. No indefinite accumulation.</w:t>
+            </w:r>
+          </w:p>
+        </w:tc>
+      </w:tr>
+    </w:tbl>
+    <w:p>
+      <w:pPr>
+        <w:spacing w:after="80"/>
+      </w:pPr>
+    </w:p>
+    <w:p>
+      <w:pPr>
+        <w:spacing w:after="120" w:before="0" w:line="280" w:lineRule="exact"/>
+      </w:pPr>
+      <w:r>
+        <w:rPr>
+          <w:i w:val="0"/>
+          <w:sz w:val="22"/>
+        </w:rPr>
+        <w:t>Workers who understand and trust the system are more likely to comply with PPE rules genuinely — not just when a camera is watching. That is the outcome the company actually needs.</w:t>
       </w:r>
     </w:p>
     <w:p>
       <w:pPr>
-        <w:spacing w:after="120" w:before="0" w:line="260" w:lineRule="exact"/>
-      </w:pPr>
-      <w:r>
-        <w:t>The technology is ready. The governance must match it. A phased rollout — starting with alert-only mode while fairness metrics are gathered, before any automated escalation is introduced — is the most responsible path forward.</w:t>
-      </w:r>
-    </w:p>
-    <w:p>
-      <w:pPr>
-        <w:spacing w:before="280" w:after="80"/>
+        <w:spacing w:before="240" w:after="80"/>
       </w:pPr>
       <w:r>
         <w:rPr>
           <w:b/>
           <w:color w:val="1F497D"/>
-          <w:sz w:val="28"/>
+          <w:sz w:val="26"/>
+        </w:rPr>
+        <w:t>7. Conclusion</w:t>
+      </w:r>
+    </w:p>
+    <w:p>
+      <w:pPr>
+        <w:spacing w:after="120" w:before="0" w:line="280" w:lineRule="exact"/>
+      </w:pPr>
+      <w:r>
+        <w:rPr>
+          <w:i w:val="0"/>
+          <w:sz w:val="22"/>
+        </w:rPr>
+        <w:t>CCTV-based PPE monitoring can meaningfully reduce injuries on the factory floor — but only if the system is built around the people it monitors, not just the hazards it is meant to prevent.</w:t>
+      </w:r>
+    </w:p>
+    <w:p>
+      <w:pPr>
+        <w:spacing w:after="120" w:before="0" w:line="280" w:lineRule="exact"/>
+      </w:pPr>
+      <w:r>
+        <w:rPr>
+          <w:i w:val="0"/>
+          <w:sz w:val="22"/>
+        </w:rPr>
+        <w:t>The legal obligations under GDPR and UAE PDPL are clear: capture only what is needed, for only as long as needed, and use it only for the purpose it was collected for. The social and ethical obligations go further: consult workers before deployment, test the model for demographic bias, keep humans in the decision loop, and audit the system regularly.</w:t>
+      </w:r>
+    </w:p>
+    <w:p>
+      <w:pPr>
+        <w:spacing w:after="120" w:before="0" w:line="280" w:lineRule="exact"/>
+      </w:pPr>
+      <w:r>
+        <w:rPr>
+          <w:i w:val="0"/>
+          <w:sz w:val="22"/>
+        </w:rPr>
+        <w:t>Technology alone does not create a safe workplace. The right governance does. A phased rollout — starting with alert-only mode while accuracy and fairness metrics are gathered — is the most responsible path forward, and the one most likely to produce lasting safety improvements.</w:t>
+      </w:r>
+    </w:p>
+    <w:p>
+      <w:pPr>
+        <w:spacing w:before="240" w:after="80"/>
+      </w:pPr>
+      <w:r>
+        <w:rPr>
+          <w:b/>
+          <w:color w:val="1F497D"/>
+          <w:sz w:val="26"/>
         </w:rPr>
         <w:t>References</w:t>
       </w:r>
@@ -433,7 +810,7 @@
         <w:rPr>
           <w:sz w:val="20"/>
         </w:rPr>
-        <w:t>UK Information Commissioner’s Office (2023). Guide to the UK GDPR. ico.org.uk</w:t>
+        <w:t>UK Information Commissioner's Office (2023). Guide to the UK GDPR. ico.org.uk</w:t>
       </w:r>
     </w:p>
     <w:p>

</xml_diff>

<commit_message>
Trim references to 3: GDPR, UAE PDPL, Gender Shades only
</commit_message>
<xml_diff>
--- a/deliverables/LSEP_Essay.docx
+++ b/deliverables/LSEP_Essay.docx
@@ -58,7 +58,6 @@
       </w:pPr>
       <w:r>
         <w:rPr>
-          <w:i w:val="0"/>
           <w:sz w:val="22"/>
         </w:rPr>
         <w:t>London Building Materials Manufacturing Ltd. plans to use CCTV cameras and a computer vision (CV) system to check whether workers on the factory floor are wearing the correct PPE — helmets, hi-vis vests, and goggles. The cameras capture photos and video, and a deep learning model flags anyone not wearing the required equipment.</w:t>
@@ -70,7 +69,6 @@
       </w:pPr>
       <w:r>
         <w:rPr>
-          <w:i w:val="0"/>
           <w:sz w:val="22"/>
         </w:rPr>
         <w:t>The safety goal is clear. But the moment a camera records a worker, four practical questions arise that determine whether the system is legal, fair, and responsible:</w:t>
@@ -126,14 +124,13 @@
     </w:p>
     <w:p>
       <w:pPr>
-        <w:spacing w:after="80" w:before="0" w:line="280" w:lineRule="exact"/>
+        <w:spacing w:after="120" w:before="0" w:line="280" w:lineRule="exact"/>
       </w:pPr>
       <w:r>
         <w:rPr>
-          <w:i w:val="0"/>
           <w:sz w:val="22"/>
         </w:rPr>
-        <w:t>This essay works through these questions across the legal, social, ethical, and professional dimensions — and proposes a practical balance that protects workers while meeting the company's safety obligations.</w:t>
+        <w:t>This essay works through these questions across the legal, social, ethical, and professional dimensions — and proposes a practical balance that protects workers while meeting the company’s safety obligations.</w:t>
       </w:r>
     </w:p>
     <w:p>
@@ -155,10 +152,9 @@
       </w:pPr>
       <w:r>
         <w:rPr>
-          <w:i w:val="0"/>
           <w:sz w:val="22"/>
         </w:rPr>
-        <w:t>The moment a camera records a worker's face, it captures personal data under the General Data Protection Regulation (GDPR). Facial images are biometric data — the most sensitive category under the law. The UAE Personal Data Protection Law (PDPL, Federal Decree-Law No. 45 of 2021) applies the same principle: recording workers requires a documented lawful basis. For PPE safety, that basis exists — but the law does not stop there.</w:t>
+        <w:t>The moment a camera records a worker’s face, it captures personal data under the General Data Protection Regulation (GDPR) [1]. Facial images are biometric data — the most sensitive category under the law. The UAE Personal Data Protection Law (PDPL, Federal Decree-Law No. 45 of 2021) [2] applies the same principle: recording workers requires a documented lawful basis. For PPE safety, that basis exists — but the obligations do not stop there.</w:t>
       </w:r>
     </w:p>
     <w:p>
@@ -176,7 +172,7 @@
         <w:rPr>
           <w:sz w:val="22"/>
         </w:rPr>
-        <w:t>The company must record the specific legal purpose: PPE compliance on active work zones. Using the same footage to track movement, measure productivity, or monitor timekeeping is a legal violation without separate consent.</w:t>
+        <w:t>The company must document the specific legal purpose: PPE compliance on active work zones only. Using the same footage to track movement, measure productivity, or monitor timekeeping is a violation of GDPR’s purpose limitation principle without separate worker consent.</w:t>
       </w:r>
     </w:p>
     <w:p>
@@ -194,7 +190,7 @@
         <w:rPr>
           <w:sz w:val="22"/>
         </w:rPr>
-        <w:t>Data minimisation requires that cameras cover only areas where PPE is mandatory — production floor, loading bays. Break rooms, canteens, and toilets must be excluded. Where technically feasible, the system should detect PPE items only, without storing identifiable facial images.</w:t>
+        <w:t>GDPR’s data minimisation principle requires cameras to cover only areas where PPE is mandatory — production floor, loading bays. Break rooms, canteens, and toilets must be excluded. Where technically feasible, the system should detect PPE items only, without storing identifiable facial images.</w:t>
       </w:r>
     </w:p>
     <w:p>
@@ -212,7 +208,7 @@
         <w:rPr>
           <w:sz w:val="22"/>
         </w:rPr>
-        <w:t>Workers must be informed in writing before the system goes live: what the camera detects, who sees the alerts, and how errors are handled. A Data Protection Impact Assessment (DPIA) is required before rollout. If the system triggers disciplinary action, workers have the legal right to human review — a fully automated disciplinary pipeline is not lawful.</w:t>
+        <w:t>Workers must be informed in writing before the system goes live. A Data Protection Impact Assessment (DPIA) — required under GDPR Article 35 for high-risk processing involving systematic monitoring of workers — must be completed before rollout. If the system triggers disciplinary action, workers have the right to human review of that decision. A fully automated disciplinary pipeline is not lawful under GDPR.</w:t>
       </w:r>
     </w:p>
     <w:p>
@@ -230,7 +226,7 @@
         <w:rPr>
           <w:sz w:val="22"/>
         </w:rPr>
-        <w:t>This is where most organisations fail. GDPR requires footage to be kept only as long as necessary. For routine compliance checks, 30 days is a widely accepted standard. Footage linked to a safety incident may be retained for 90–180 days — but this must be documented and automatically enforced, not left to accumulate indefinitely.</w:t>
+        <w:t>GDPR’s storage limitation principle requires footage to be retained only as long as necessary. For routine compliance checks, 30 days is a widely accepted standard. Footage linked to a safety incident may be retained for 90–180 days — but this must be documented in the DPIA and automatically enforced, not left to accumulate.</w:t>
       </w:r>
     </w:p>
     <w:p>
@@ -239,10 +235,9 @@
       </w:pPr>
       <w:r>
         <w:rPr>
-          <w:i w:val="0"/>
           <w:sz w:val="22"/>
         </w:rPr>
-        <w:t>HSE (UK) and OSHA (US) place a legal duty of care on employers to enforce PPE compliance. The CV system supports this duty. However, false negatives — cases where the model misses a worker without a helmet — are a legal liability. If a worker is injured after an undetected violation, relying solely on an imperfect AI system without human checks exposes the company to significant legal risk.</w:t>
+        <w:t>A false negative — where the model fails to detect a missing helmet and a worker is later injured — creates legal liability. The company cannot simply point to the CV system; it must demonstrate that the system was supervised and its limitations were known and managed.</w:t>
       </w:r>
     </w:p>
     <w:p>
@@ -273,7 +268,7 @@
         <w:rPr>
           <w:sz w:val="22"/>
         </w:rPr>
-        <w:t>Workers who feel constantly watched often become anxious and slow down — not because they are doing anything wrong, but because they are aware of being observed at all times. This is called the chilling effect. The system is meant to improve safety; if it raises stress and reduces performance, it has created new risks instead of reducing them.</w:t>
+        <w:t>Workers who feel constantly watched often become anxious and risk-averse. They may slow down or avoid certain tasks they think the camera will misread. This is the chilling effect — a well-documented consequence of continuous workplace surveillance. The system is meant to improve safety; if it raises stress and reduces performance, it has created new risks instead of reducing them.</w:t>
       </w:r>
     </w:p>
     <w:p>
@@ -291,7 +286,7 @@
         <w:rPr>
           <w:sz w:val="22"/>
         </w:rPr>
-        <w:t>There is a meaningful difference between workers who wear PPE because they understand why it matters, and workers who wear it because a camera is watching. The second group will stop complying the moment surveillance lapses. A camera system that replaces safety culture rather than reinforcing it is fragile. Workers should be involved in shaping how the system works — they often know the real compliance problems better than management does.</w:t>
+        <w:t>There is a meaningful difference between workers who wear PPE because they understand why it matters, and those who wear it only because a camera is watching. The second group will stop complying the moment surveillance lapses. A camera system that replaces safety culture rather than reinforcing it is fragile. Workers should be involved in shaping how the system is used — they often know where the real compliance problems are and why they occur.</w:t>
       </w:r>
     </w:p>
     <w:p>
@@ -309,7 +304,7 @@
         <w:rPr>
           <w:sz w:val="22"/>
         </w:rPr>
-        <w:t>Deploying any monitoring system without prior consultation damages trust. Workers who feel watched but not heard will view the system as punitive, not protective. Involving worker representatives, safety committees, and unions in the design process produces better outcomes and reduces resistance.</w:t>
+        <w:t>Deploying a monitoring system without prior consultation damages trust, regardless of intent. Workers who feel watched but not heard will view the system as punitive. Involving worker representatives and safety committees in the design process produces better outcomes and reduces resistance.</w:t>
       </w:r>
     </w:p>
     <w:p>
@@ -327,7 +322,7 @@
         <w:rPr>
           <w:sz w:val="22"/>
         </w:rPr>
-        <w:t>A camera installed for PPE safety can quietly expand into productivity tracking, break-time monitoring, or behavioural analysis — without workers consenting to this broader use. The company must publish a binding policy that limits use to safety compliance only, reviewed annually with worker input.</w:t>
+        <w:t>A camera installed for PPE safety can gradually expand into productivity tracking or attendance monitoring without re-consent. The company must publish and enforce a binding policy that limits use to safety compliance only, reviewed annually with worker input.</w:t>
       </w:r>
     </w:p>
     <w:p>
@@ -358,7 +353,7 @@
         <w:rPr>
           <w:sz w:val="22"/>
         </w:rPr>
-        <w:t>The CV model learns from its training data. If that data does not represent the full diversity of the workforce — different skin tones, body sizes, protective gear styles — the model will be less accurate for underrepresented groups. Buolamwini and Gebru's 2018 Gender Shades study found that commercial CV systems had error rates up to 34% higher for dark-skinned women. A PPE system with similar bias will flag certain workers disproportionately — creating discriminatory enforcement driven by model error, not actual non-compliance.</w:t>
+        <w:t>The CV model learns from its training data. If that data does not represent the full diversity of the workforce — different skin tones, body sizes, protective gear styles — the model will be less accurate for underrepresented groups. Buolamwini and Gebru’s Gender Shades study (2018) [3] found error rates up to 34% higher for dark-skinned women in commercial CV systems. A PPE system with similar bias will flag certain workers disproportionately — creating unequal enforcement driven by model error, not actual non-compliance.</w:t>
       </w:r>
     </w:p>
     <w:p>
@@ -376,7 +371,7 @@
         <w:rPr>
           <w:sz w:val="22"/>
         </w:rPr>
-        <w:t>Workers should not learn about the system from a notice on the wall after it is already running. They should be told before deployment: what the camera captures, how accurate the model is, what happens when it raises an alert, and how to challenge a decision they believe is wrong.</w:t>
+        <w:t>Workers should not learn about the system from a wall notice after it is already running. Before deployment they should know: what the camera captures, how accurate the model is, what triggers an alert, and how to challenge a decision they believe is wrong.</w:t>
       </w:r>
     </w:p>
     <w:p>
@@ -394,7 +389,7 @@
         <w:rPr>
           <w:sz w:val="22"/>
         </w:rPr>
-        <w:t>The system should do only what is needed for safety. It should not log which zone a worker stands in, how often they move, or how long they take on a task. If regular supervisor checks or improved PPE availability could achieve comparable safety outcomes with less invasiveness, those options should be documented and considered alongside the camera system.</w:t>
+        <w:t>The system should do only what is needed for safety — not log movement patterns, task duration, or social interactions. If regular supervisor checks or improved PPE availability could achieve comparable safety outcomes with less invasiveness, those options should be evaluated and documented alongside the camera system.</w:t>
       </w:r>
     </w:p>
     <w:p>
@@ -412,7 +407,7 @@
         <w:rPr>
           <w:sz w:val="22"/>
         </w:rPr>
-        <w:t>Workers — particularly those in temporary or non-unionised roles — have limited ability to contest automated decisions. This imbalance places a heightened duty on the organisation: the system must never be used in a way that harms workers who cannot easily defend themselves.</w:t>
+        <w:t>Workers in temporary or non-unionised roles have limited ability to contest automated decisions. This places a heightened duty on the organisation to ensure the system is never used in ways that harm workers who cannot easily defend themselves.</w:t>
       </w:r>
     </w:p>
     <w:p>
@@ -437,13 +432,13 @@
           <w:b/>
           <w:sz w:val="22"/>
         </w:rPr>
-        <w:t xml:space="preserve">Codes of ethics. </w:t>
+        <w:t xml:space="preserve">Responsibility to disclose. </w:t>
       </w:r>
       <w:r>
         <w:rPr>
           <w:sz w:val="22"/>
         </w:rPr>
-        <w:t>The BCS, IEEE, and ACM all require computing professionals to place public welfare above commercial interest. The engineers building this system have a professional obligation to test accuracy across all worker demographics, document known failure modes honestly, and refuse deployment if they believe the system will cause harm.</w:t>
+        <w:t>Engineers and data scientists building this system have a professional obligation to test model accuracy across all worker demographics, document known failure modes honestly, and communicate limitations clearly to management — even when that is not what management wants to hear.</w:t>
       </w:r>
     </w:p>
     <w:p>
@@ -461,7 +456,7 @@
         <w:rPr>
           <w:sz w:val="22"/>
         </w:rPr>
-        <w:t>Responsible deployment requires a model card: a plain-language document stating what the model detects, how accurate it is, which groups it was tested on, and what its known weaknesses are. Without this, the organisation cannot make informed decisions about when to trust or override the system.</w:t>
+        <w:t>Responsible deployment requires a model card: a plain-language document stating what the model detects, how accurate it is, which groups it was tested on, and what its known weaknesses are. This also satisfies GDPR’s transparency and accountability requirements.</w:t>
       </w:r>
     </w:p>
     <w:p>
@@ -479,7 +474,7 @@
         <w:rPr>
           <w:sz w:val="22"/>
         </w:rPr>
-        <w:t>No automated alert should directly trigger a disciplinary action. A safety officer or line manager must review each flag, consider the context, and decide whether to act. The Clearview AI case — where billions of faces were scraped and processed without consent, resulting in multiple GDPR enforcement actions — and the Amazon Rekognition controversy — where demographic bias was demonstrated at scale in a widely-deployed CV system — both show what happens when AI is deployed without adequate human oversight.</w:t>
+        <w:t>No automated alert should directly trigger a disciplinary action. A safety officer or line manager must review each flag, consider the context, and decide whether to act. The Clearview AI case — billions of faces processed without consent, leading to multiple GDPR enforcement actions — and the Amazon Rekognition controversy — significant demographic bias demonstrated at scale — both illustrate what happens when AI systems run without adequate human oversight.</w:t>
       </w:r>
     </w:p>
     <w:p>
@@ -497,7 +492,7 @@
         <w:rPr>
           <w:sz w:val="22"/>
         </w:rPr>
-        <w:t>Accuracy drifts as factory conditions change: new lighting, seasonal PPE variations, workforce changes. The system should be audited quarterly. If error rates rise for any group of workers, the model must be retrained before enforcement continues. Audit results should be shared with worker representatives. This is consistent with the UAE AI Strategy, which mandates fairness, transparency, and accountability in AI applications within the workplace.</w:t>
+        <w:t>Model accuracy drifts as conditions change: lighting, seasonal PPE variations, workforce turnover. The system should be audited quarterly, with results shared with worker representatives. If error rates rise for any group, the model must be retrained before enforcement continues.</w:t>
       </w:r>
     </w:p>
     <w:p>
@@ -519,10 +514,9 @@
       </w:pPr>
       <w:r>
         <w:rPr>
-          <w:i w:val="0"/>
           <w:sz w:val="22"/>
         </w:rPr>
-        <w:t>The four questions — why, what, how, and how long — translate directly into a practical governance framework. Getting these right protects the company legally and produces a system that workers can trust:</w:t>
+        <w:t>The four questions translate into a clear governance framework. Applying it consistently protects the company legally and builds the worker trust that makes the system effective in practice:</w:t>
       </w:r>
     </w:p>
     <w:tbl>
@@ -602,7 +596,7 @@
               <w:rPr>
                 <w:sz w:val="20"/>
               </w:rPr>
-              <w:t>PPE compliance only. Purpose documented in writing. No secondary use without re-consent.</w:t>
+              <w:t>PPE compliance only. Purpose documented. No secondary use without re-consent.</w:t>
             </w:r>
           </w:p>
         </w:tc>
@@ -636,7 +630,7 @@
               <w:rPr>
                 <w:sz w:val="20"/>
               </w:rPr>
-              <w:t>Active work zones only. No break rooms or canteens. No identifiable face storage where avoidable. No behavioural tracking.</w:t>
+              <w:t>Active work zones only. No break rooms or canteens. No face storage where avoidable. No behavioural tracking.</w:t>
             </w:r>
           </w:p>
         </w:tc>
@@ -670,7 +664,7 @@
               <w:rPr>
                 <w:sz w:val="20"/>
               </w:rPr>
-              <w:t>Workers informed and consulted before go-live. DPIA completed. Human review before any disciplinary action. Alerts, not automatic penalties.</w:t>
+              <w:t>Workers informed before go-live. DPIA completed (GDPR Art. 35). Human review before any disciplinary action.</w:t>
             </w:r>
           </w:p>
         </w:tc>
@@ -704,7 +698,7 @@
               <w:rPr>
                 <w:sz w:val="20"/>
               </w:rPr>
-              <w:t>30 days for routine checks. 90–180 days for incident footage. Automatic deletion enforced. No indefinite accumulation.</w:t>
+              <w:t>30 days for routine checks. 90–180 days for incident footage. Automatic deletion enforced per DPIA.</w:t>
             </w:r>
           </w:p>
         </w:tc>
@@ -721,7 +715,6 @@
       </w:pPr>
       <w:r>
         <w:rPr>
-          <w:i w:val="0"/>
           <w:sz w:val="22"/>
         </w:rPr>
         <w:t>Workers who understand and trust the system are more likely to comply with PPE rules genuinely — not just when a camera is watching. That is the outcome the company actually needs.</w:t>
@@ -746,7 +739,6 @@
       </w:pPr>
       <w:r>
         <w:rPr>
-          <w:i w:val="0"/>
           <w:sz w:val="22"/>
         </w:rPr>
         <w:t>CCTV-based PPE monitoring can meaningfully reduce injuries on the factory floor — but only if the system is built around the people it monitors, not just the hazards it is meant to prevent.</w:t>
@@ -758,10 +750,9 @@
       </w:pPr>
       <w:r>
         <w:rPr>
-          <w:i w:val="0"/>
           <w:sz w:val="22"/>
         </w:rPr>
-        <w:t>The legal obligations under GDPR and UAE PDPL are clear: capture only what is needed, for only as long as needed, and use it only for the purpose it was collected for. The social and ethical obligations go further: consult workers before deployment, test the model for demographic bias, keep humans in the decision loop, and audit the system regularly.</w:t>
+        <w:t>The legal obligations under GDPR and UAE PDPL are clear: capture only what is needed, for only as long as needed, and use it only for the stated purpose. The social and ethical obligations go further: consult workers before deployment, test the model for demographic bias, keep humans in the decision loop, and audit the system regularly.</w:t>
       </w:r>
     </w:p>
     <w:p>
@@ -770,10 +761,9 @@
       </w:pPr>
       <w:r>
         <w:rPr>
-          <w:i w:val="0"/>
           <w:sz w:val="22"/>
         </w:rPr>
-        <w:t>Technology alone does not create a safe workplace. The right governance does. A phased rollout — starting with alert-only mode while accuracy and fairness metrics are gathered — is the most responsible path forward, and the one most likely to produce lasting safety improvements.</w:t>
+        <w:t>Technology alone does not create a safe workplace. Responsible governance does. A phased rollout — starting with alert-only mode while accuracy and fairness metrics are gathered — is the most responsible path forward.</w:t>
       </w:r>
     </w:p>
     <w:p>
@@ -792,97 +782,37 @@
     <w:p>
       <w:pPr>
         <w:pStyle w:val="ListNumber"/>
-        <w:spacing w:after="60" w:before="0" w:line="260" w:lineRule="exact"/>
+        <w:spacing w:after="80" w:before="0" w:line="260" w:lineRule="exact"/>
       </w:pPr>
       <w:r>
         <w:rPr>
           <w:sz w:val="20"/>
         </w:rPr>
-        <w:t>Buolamwini, J. &amp; Gebru, T. (2018). Gender Shades: Intersectional Accuracy Disparities in Commercial Gender Classification. Proceedings of Machine Learning Research.</w:t>
+        <w:t>General Data Protection Regulation (GDPR) — Regulation (EU) 2016/679. UK ICO Guide to the UK GDPR (2023). ico.org.uk</w:t>
       </w:r>
     </w:p>
     <w:p>
       <w:pPr>
         <w:pStyle w:val="ListNumber"/>
-        <w:spacing w:after="60" w:before="0" w:line="260" w:lineRule="exact"/>
+        <w:spacing w:after="80" w:before="0" w:line="260" w:lineRule="exact"/>
       </w:pPr>
       <w:r>
         <w:rPr>
           <w:sz w:val="20"/>
         </w:rPr>
-        <w:t>UK Information Commissioner's Office (2023). Guide to the UK GDPR. ico.org.uk</w:t>
+        <w:t>UAE Federal Decree-Law No. 45 of 2021 on the Protection of Personal Data (PDPL). UAE Ministry of Justice.</w:t>
       </w:r>
     </w:p>
     <w:p>
       <w:pPr>
         <w:pStyle w:val="ListNumber"/>
-        <w:spacing w:after="60" w:before="0" w:line="260" w:lineRule="exact"/>
+        <w:spacing w:after="80" w:before="0" w:line="260" w:lineRule="exact"/>
       </w:pPr>
       <w:r>
         <w:rPr>
           <w:sz w:val="20"/>
         </w:rPr>
-        <w:t>UAE Federal Decree-Law No. 45 of 2021 on the Protection of Personal Data.</w:t>
-      </w:r>
-    </w:p>
-    <w:p>
-      <w:pPr>
-        <w:pStyle w:val="ListNumber"/>
-        <w:spacing w:after="60" w:before="0" w:line="260" w:lineRule="exact"/>
-      </w:pPr>
-      <w:r>
-        <w:rPr>
-          <w:sz w:val="20"/>
-        </w:rPr>
-        <w:t>UAE Office of Artificial Intelligence (2017). UAE National AI Strategy 2031.</w:t>
-      </w:r>
-    </w:p>
-    <w:p>
-      <w:pPr>
-        <w:pStyle w:val="ListNumber"/>
-        <w:spacing w:after="60" w:before="0" w:line="260" w:lineRule="exact"/>
-      </w:pPr>
-      <w:r>
-        <w:rPr>
-          <w:sz w:val="20"/>
-        </w:rPr>
-        <w:t>BCS, The Chartered Institute for IT (2022). Code of Conduct.</w:t>
-      </w:r>
-    </w:p>
-    <w:p>
-      <w:pPr>
-        <w:pStyle w:val="ListNumber"/>
-        <w:spacing w:after="60" w:before="0" w:line="260" w:lineRule="exact"/>
-      </w:pPr>
-      <w:r>
-        <w:rPr>
-          <w:sz w:val="20"/>
-        </w:rPr>
-        <w:t>IEEE (2020). IEEE Code of Ethics.</w:t>
-      </w:r>
-    </w:p>
-    <w:p>
-      <w:pPr>
-        <w:pStyle w:val="ListNumber"/>
-        <w:spacing w:after="60" w:before="0" w:line="260" w:lineRule="exact"/>
-      </w:pPr>
-      <w:r>
-        <w:rPr>
-          <w:sz w:val="20"/>
-        </w:rPr>
-        <w:t>HSE (UK). Personal Protective Equipment at Work Regulations 1992 (as amended 2022).</w:t>
-      </w:r>
-    </w:p>
-    <w:p>
-      <w:pPr>
-        <w:pStyle w:val="ListNumber"/>
-        <w:spacing w:after="60" w:before="0" w:line="260" w:lineRule="exact"/>
-      </w:pPr>
-      <w:r>
-        <w:rPr>
-          <w:sz w:val="20"/>
-        </w:rPr>
-        <w:t>Schwartz, R. et al. (2022). Towards a Standard for Identifying and Managing Bias in Artificial Intelligence. NIST Special Publication 1270.</w:t>
+        <w:t>Buolamwini, J. &amp; Gebru, T. (2018). Gender Shades: Intersectional Accuracy Disparities in Commercial Gender Classification. Proceedings of Machine Learning Research, 81, 1–15.</w:t>
       </w:r>
     </w:p>
     <w:sectPr>

</xml_diff>

<commit_message>
Replace UAE PDPL with EU AI Act; 3 globally recognised references only
</commit_message>
<xml_diff>
--- a/deliverables/LSEP_Essay.docx
+++ b/deliverables/LSEP_Essay.docx
@@ -154,7 +154,7 @@
         <w:rPr>
           <w:sz w:val="22"/>
         </w:rPr>
-        <w:t>The moment a camera records a worker’s face, it captures personal data under the General Data Protection Regulation (GDPR) [1]. Facial images are biometric data — the most sensitive category under the law. The UAE Personal Data Protection Law (PDPL, Federal Decree-Law No. 45 of 2021) [2] applies the same principle: recording workers requires a documented lawful basis. For PPE safety, that basis exists — but the obligations do not stop there.</w:t>
+        <w:t>The moment a camera records a worker’s face, it captures personal data. Under the General Data Protection Regulation (GDPR) [1], facial images are biometric data — the most sensitive category under the law. The company must establish a lawful basis for processing before any footage is captured. For PPE safety, a legitimate interest basis exists — but several further obligations apply.</w:t>
       </w:r>
     </w:p>
     <w:p>
@@ -172,7 +172,7 @@
         <w:rPr>
           <w:sz w:val="22"/>
         </w:rPr>
-        <w:t>The company must document the specific legal purpose: PPE compliance on active work zones only. Using the same footage to track movement, measure productivity, or monitor timekeeping is a violation of GDPR’s purpose limitation principle without separate worker consent.</w:t>
+        <w:t>GDPR’s purpose limitation principle requires the company to document a specific legal purpose: PPE compliance monitoring on active work zones only. Using the same footage to track movement, measure productivity, or monitor timekeeping is a violation without separate worker consent.</w:t>
       </w:r>
     </w:p>
     <w:p>
@@ -190,7 +190,7 @@
         <w:rPr>
           <w:sz w:val="22"/>
         </w:rPr>
-        <w:t>GDPR’s data minimisation principle requires cameras to cover only areas where PPE is mandatory — production floor, loading bays. Break rooms, canteens, and toilets must be excluded. Where technically feasible, the system should detect PPE items only, without storing identifiable facial images.</w:t>
+        <w:t>GDPR’s data minimisation principle requires cameras to cover only areas where PPE is mandatory — production floor, loading bays. Break rooms, canteens, and toilets must be excluded. Where technically feasible, the system should process PPE-relevant features only, without storing identifiable facial images.</w:t>
       </w:r>
     </w:p>
     <w:p>
@@ -208,7 +208,7 @@
         <w:rPr>
           <w:sz w:val="22"/>
         </w:rPr>
-        <w:t>Workers must be informed in writing before the system goes live. A Data Protection Impact Assessment (DPIA) — required under GDPR Article 35 for high-risk processing involving systematic monitoring of workers — must be completed before rollout. If the system triggers disciplinary action, workers have the right to human review of that decision. A fully automated disciplinary pipeline is not lawful under GDPR.</w:t>
+        <w:t>GDPR Article 35 requires a Data Protection Impact Assessment (DPIA) before deploying any system that involves systematic monitoring of workers. Workers must be informed in writing before go-live. The EU AI Act (2024) [2] classifies AI systems used for real-time monitoring of individuals in publicly accessible spaces — including factory floors — as high-risk. This triggers mandatory conformity assessments, human oversight requirements, and transparency obligations before the system can be deployed. If the system triggers disciplinary action, workers have the legal right to human review — a fully automated disciplinary pipeline is not lawful under either framework.</w:t>
       </w:r>
     </w:p>
     <w:p>
@@ -237,7 +237,7 @@
         <w:rPr>
           <w:sz w:val="22"/>
         </w:rPr>
-        <w:t>A false negative — where the model fails to detect a missing helmet and a worker is later injured — creates legal liability. The company cannot simply point to the CV system; it must demonstrate that the system was supervised and its limitations were known and managed.</w:t>
+        <w:t>A false negative — where the model fails to detect a missing helmet and a worker is later injured — creates legal liability. The company must demonstrate that the system was actively supervised and its limitations were known and managed.</w:t>
       </w:r>
     </w:p>
     <w:p>
@@ -353,7 +353,7 @@
         <w:rPr>
           <w:sz w:val="22"/>
         </w:rPr>
-        <w:t>The CV model learns from its training data. If that data does not represent the full diversity of the workforce — different skin tones, body sizes, protective gear styles — the model will be less accurate for underrepresented groups. Buolamwini and Gebru’s Gender Shades study (2018) [3] found error rates up to 34% higher for dark-skinned women in commercial CV systems. A PPE system with similar bias will flag certain workers disproportionately — creating unequal enforcement driven by model error, not actual non-compliance.</w:t>
+        <w:t>The CV model learns from its training data. If that data does not represent the full diversity of the workforce — different skin tones, body sizes, protective gear styles — the model will be less accurate for underrepresented groups. Buolamwini and Gebru’s Gender Shades study (2018) [3] found error rates up to 34% higher for dark-skinned women in commercial CV systems. A PPE system with similar bias will flag certain workers disproportionately — creating unequal enforcement driven by model error, not actual non-compliance. The EU AI Act [2] explicitly requires high-risk AI systems to be tested for bias across demographic groups before deployment.</w:t>
       </w:r>
     </w:p>
     <w:p>
@@ -456,7 +456,7 @@
         <w:rPr>
           <w:sz w:val="22"/>
         </w:rPr>
-        <w:t>Responsible deployment requires a model card: a plain-language document stating what the model detects, how accurate it is, which groups it was tested on, and what its known weaknesses are. This also satisfies GDPR’s transparency and accountability requirements.</w:t>
+        <w:t>Responsible deployment requires a model card: a plain-language document stating what the model detects, how accurate it is, which groups it was tested on, and what its known weaknesses are. The EU AI Act [2] makes this a legal requirement for high-risk AI systems — technical documentation and logs must be maintained and made available to regulators on request.</w:t>
       </w:r>
     </w:p>
     <w:p>
@@ -474,7 +474,7 @@
         <w:rPr>
           <w:sz w:val="22"/>
         </w:rPr>
-        <w:t>No automated alert should directly trigger a disciplinary action. A safety officer or line manager must review each flag, consider the context, and decide whether to act. The Clearview AI case — billions of faces processed without consent, leading to multiple GDPR enforcement actions — and the Amazon Rekognition controversy — significant demographic bias demonstrated at scale — both illustrate what happens when AI systems run without adequate human oversight.</w:t>
+        <w:t>No automated alert should directly trigger a disciplinary action. A safety officer or line manager must review each flag, consider the context, and decide whether to act. The EU AI Act [2] mandates human oversight for all high-risk AI systems — it must be possible for a human to intervene, override, or shut down the system at any point. The Clearview AI case — billions of faces processed without consent, leading to multiple GDPR enforcement actions — and the Amazon Rekognition controversy — significant demographic bias demonstrated at scale — both show what happens when AI systems run without adequate oversight.</w:t>
       </w:r>
     </w:p>
     <w:p>
@@ -492,7 +492,7 @@
         <w:rPr>
           <w:sz w:val="22"/>
         </w:rPr>
-        <w:t>Model accuracy drifts as conditions change: lighting, seasonal PPE variations, workforce turnover. The system should be audited quarterly, with results shared with worker representatives. If error rates rise for any group, the model must be retrained before enforcement continues.</w:t>
+        <w:t>Model accuracy drifts as conditions change: lighting, seasonal PPE variations, workforce turnover. The EU AI Act requires post-market monitoring for high-risk systems throughout their operational lifetime. The system should be audited quarterly, with results shared with worker representatives. If error rates rise for any group, the model must be retrained before enforcement continues.</w:t>
       </w:r>
     </w:p>
     <w:p>
@@ -516,7 +516,7 @@
         <w:rPr>
           <w:sz w:val="22"/>
         </w:rPr>
-        <w:t>The four questions translate into a clear governance framework. Applying it consistently protects the company legally and builds the worker trust that makes the system effective in practice:</w:t>
+        <w:t>The four questions translate into a clear governance framework. Applying it consistently satisfies GDPR and EU AI Act obligations, and builds the worker trust that makes the system effective in practice:</w:t>
       </w:r>
     </w:p>
     <w:tbl>
@@ -596,7 +596,7 @@
               <w:rPr>
                 <w:sz w:val="20"/>
               </w:rPr>
-              <w:t>PPE compliance only. Purpose documented. No secondary use without re-consent.</w:t>
+              <w:t>PPE compliance only. Purpose documented under GDPR. No secondary use without re-consent.</w:t>
             </w:r>
           </w:p>
         </w:tc>
@@ -664,7 +664,7 @@
               <w:rPr>
                 <w:sz w:val="20"/>
               </w:rPr>
-              <w:t>Workers informed before go-live. DPIA completed (GDPR Art. 35). Human review before any disciplinary action.</w:t>
+              <w:t>DPIA completed (GDPR Art. 35). EU AI Act conformity assessment for high-risk AI. Workers informed before go-live. Human review before any disciplinary action.</w:t>
             </w:r>
           </w:p>
         </w:tc>
@@ -698,7 +698,7 @@
               <w:rPr>
                 <w:sz w:val="20"/>
               </w:rPr>
-              <w:t>30 days for routine checks. 90–180 days for incident footage. Automatic deletion enforced per DPIA.</w:t>
+              <w:t>30 days for routine checks. 90–180 days for incident footage. Automatic deletion enforced and documented in the DPIA.</w:t>
             </w:r>
           </w:p>
         </w:tc>
@@ -752,7 +752,7 @@
         <w:rPr>
           <w:sz w:val="22"/>
         </w:rPr>
-        <w:t>The legal obligations under GDPR and UAE PDPL are clear: capture only what is needed, for only as long as needed, and use it only for the stated purpose. The social and ethical obligations go further: consult workers before deployment, test the model for demographic bias, keep humans in the decision loop, and audit the system regularly.</w:t>
+        <w:t>GDPR and the EU AI Act together set a clear bar: capture only what is needed, for only as long as needed, use it only for the stated purpose, test it for bias before deployment, and keep a human in the decision loop at all times. The Gender Shades study is a practical reminder that a system not tested for demographic fairness will enforce rules unequally — which is both an ethical failure and a legal risk under the EU AI Act.</w:t>
       </w:r>
     </w:p>
     <w:p>
@@ -788,7 +788,7 @@
         <w:rPr>
           <w:sz w:val="20"/>
         </w:rPr>
-        <w:t>General Data Protection Regulation (GDPR) — Regulation (EU) 2016/679. UK ICO Guide to the UK GDPR (2023). ico.org.uk</w:t>
+        <w:t>General Data Protection Regulation (GDPR) — Regulation (EU) 2016/679 of the European Parliament and of the Council. Official Journal of the European Union, 2016.</w:t>
       </w:r>
     </w:p>
     <w:p>
@@ -800,7 +800,7 @@
         <w:rPr>
           <w:sz w:val="20"/>
         </w:rPr>
-        <w:t>UAE Federal Decree-Law No. 45 of 2021 on the Protection of Personal Data (PDPL). UAE Ministry of Justice.</w:t>
+        <w:t>EU AI Act — Regulation (EU) 2024/1689 of the European Parliament and of the Council on Artificial Intelligence. Official Journal of the European Union, 2024.</w:t>
       </w:r>
     </w:p>
     <w:p>

</xml_diff>